<commit_message>
Restore cleaner AWS architecture diagram
</commit_message>
<xml_diff>
--- a/Lab1-editable.docx
+++ b/Lab1-editable.docx
@@ -1532,11 +1532,11 @@
               <a:graphicData uri="http://schemas.openxmlformats.org/drawingml/2006/picture">
                 <pic:pic>
                   <pic:nvPicPr>
-                    <pic:cNvPr id="0" name="priya-architecture-drawio.png"/>
+                    <pic:cNvPr id="0" name="image.png"/>
                     <pic:cNvPicPr/>
                   </pic:nvPicPr>
                   <pic:blipFill>
-                    <a:blip r:embed="rId16"/>
+                    <a:blip r:embed="rId15"/>
                     <a:stretch>
                       <a:fillRect/>
                     </a:stretch>

</xml_diff>

<commit_message>
Add AI use declaration
</commit_message>
<xml_diff>
--- a/Lab1-editable.docx
+++ b/Lab1-editable.docx
@@ -3223,6 +3223,17 @@
         <w:t>Repository: https://github.com/horiiiiii032929/cs5224-lab1-priya-wedding-gallery</w:t>
       </w:r>
     </w:p>
+    <w:p>
+      <w:pPr>
+        <w:spacing w:before="0"/>
+      </w:pPr>
+      <w:r>
+        <w:rPr>
+          <w:sz w:val="18"/>
+        </w:rPr>
+        <w:t>AI declaration: Claude Opus 4.5 and OpenAI GPT-5.6 Sol (medium reasoning) were used to assist with drafting, formatting, and diagram refinement. All generated material was reviewed and verified by the student.</w:t>
+      </w:r>
+    </w:p>
     <w:sectPr>
       <w:pgSz w:w="11906" w:h="16838"/>
       <w:pgMar w:top="1134" w:right="1247" w:bottom="1134" w:left="1247" w:header="720" w:footer="720" w:gutter="0"/>

</xml_diff>

<commit_message>
Correct Part 2 implementation and security claims
</commit_message>
<xml_diff>
--- a/Lab1-editable.docx
+++ b/Lab1-editable.docx
@@ -1478,7 +1478,7 @@
     </w:p>
     <w:p>
       <w:r>
-        <w:t>Priya's system is a private S3 bucket behind Cognito sign-in. The only custom code is one small "add couple" function; every other piece is a managed AWS service.</w:t>
+        <w:t>Part 2 proposes a private S3 bucket behind Cognito sign-in. The only custom backend business logic would be the small "add couple" function; the remaining components are managed AWS services. The full system was designed, but not deployed, for this lab.</w:t>
       </w:r>
     </w:p>
     <w:p>
@@ -1491,7 +1491,7 @@
     </w:p>
     <w:p>
       <w:r>
-        <w:t xml:space="preserve">The system is one AWS Amplify Gen 2 app in ap-southeast-1: Amplify Hosting serves the web app through CloudFront, and the backend (Cognito, S3, Lambda) is defined as TypeScript code and deployed with AWS CDK. Each couple's sign-in carries a </w:t>
+        <w:t xml:space="preserve">The system is one AWS Amplify Gen 2 app in ap-southeast-1: Amplify Hosting serves the web app through CloudFront, and the proposed backend (Cognito, S3, Lambda) would be defined as TypeScript code and deployed with AWS CDK. Each couple's sign-in carries a </w:t>
       </w:r>
       <w:r>
         <w:rPr>
@@ -1643,7 +1643,7 @@
               <w:rPr>
                 <w:sz w:val="19"/>
               </w:rPr>
-              <w:t>Priya and couples sign in on Cognito's hosted pages. Couples use a one-time email code, so they have no password.</w:t>
+              <w:t>Priya and couples sign in on Cognito managed login pages. Couples use a one-time email code, so they have no password.</w:t>
             </w:r>
           </w:p>
         </w:tc>
@@ -2110,7 +2110,7 @@
               <w:rPr>
                 <w:sz w:val="19"/>
               </w:rPr>
-              <w:t>Accounts for Priya and each couple. AWS hosts the sign-in pages; couples sign in with a one-time email code.</w:t>
+              <w:t>Accounts for Priya and each couple. Cognito managed login handles sign-in; couples use a one-time email code. The user pool uses the Essentials tier, with email delivery configured through Amazon SES.</w:t>
             </w:r>
           </w:p>
         </w:tc>
@@ -2124,7 +2124,7 @@
               <w:rPr>
                 <w:sz w:val="19"/>
               </w:rPr>
-              <w:t>No login code to write or secure. Couples have no password to forget. It's free up to 10,000 monthly active users; Priya has about 80 couples a year.</w:t>
+              <w:t>No login code to write or secure. Couples have no password to forget. Cognito is free up to 10,000 monthly active users; SES email charges are separate but negligible at this scale. Priya has about 80 couples a year.</w:t>
             </w:r>
           </w:p>
         </w:tc>
@@ -2282,7 +2282,7 @@
               <w:rPr>
                 <w:sz w:val="19"/>
               </w:rPr>
-              <w:t>Priya uploads weekly without touching the AWS console. Hosting deploys from Git and serves through CloudFront over HTTPS. Gen 2 also defines Cognito, S3 and Lambda as TypeScript code (defineAuth, defineStorage, defineFunction) deployed by CDK, so the whole system can be rebuilt from Git. A custom React gallery would look nicer but take weeks to build.</w:t>
+              <w:t>Priya uploads weekly without touching the AWS console. Hosting deploys from Git and serves through CloudFront over HTTPS. In an implementation, Gen 2 would define Cognito, S3 and Lambda as TypeScript code (defineAuth, defineStorage, defineFunction) deployed by CDK, so the configuration could be version-controlled in Git. A custom React gallery would look nicer but take weeks to build.</w:t>
             </w:r>
           </w:p>
         </w:tc>
@@ -2369,7 +2369,7 @@
               <w:rPr>
                 <w:sz w:val="19"/>
               </w:rPr>
-              <w:t>The only custom code, about 20 lines. Doing this by hand in the Cognito console is error-prone for a non-technical user.</w:t>
+              <w:t>The only custom backend business logic, about 20 lines. Doing this by hand in the Cognito console is error-prone for a non-technical user.</w:t>
             </w:r>
           </w:p>
         </w:tc>
@@ -2762,7 +2762,7 @@
         <w:t>add-couple</w:t>
       </w:r>
       <w:r>
-        <w:t xml:space="preserve"> Lambda. Couples sign in with a one-time email code, so no password is stored or shared. The identity pool issues credentials that expire after 1 hour, and Storage Browser uses them to sign each download, so any download link copied out of the app stops working within the hour. Nothing long-lived, such as an access key, is ever given to Priya or a couple.</w:t>
+        <w:t xml:space="preserve"> Lambda. The function accepts only lowercase letters, digits and hyphens for wedding_id, preventing IAM wildcard characters from entering the principal tag. Couples sign in with a one-time email code, so no password is stored or shared. The identity pool issues temporary credentials, and Storage Browser signs S3 requests or generates short-lived presigned URLs. A copied URL expires at its configured expiry or sooner when the underlying role session expires. Nothing long-lived, such as an access key, is ever given to Priya or a couple.</w:t>
       </w:r>
     </w:p>
     <w:p>
@@ -3220,7 +3220,7 @@
         <w:rPr>
           <w:sz w:val="18"/>
         </w:rPr>
-        <w:t>Repository: https://github.com/horiiiiii032929/cs5224-lab1-priya-wedding-gallery</w:t>
+        <w:t>Repository (Part 1 proof-of-concept and editable report assets): https://github.com/horiiiiii032929/cs5224-lab1-priya-wedding-gallery</w:t>
       </w:r>
     </w:p>
     <w:p>

</xml_diff>